<commit_message>
added new module actividades and updated report generation with ai
</commit_message>
<xml_diff>
--- a/public/plantilla-reporte.docx
+++ b/public/plantilla-reporte.docx
@@ -34,16 +34,23 @@
         <w:rPr>
           <w:rFonts w:ascii="Arial Narrow" w:hAnsi="Arial Narrow"/>
           <w:b/>
+        </w:rPr>
+      </w:pPr>
+      <w:r>
+        <w:rPr>
+          <w:rFonts w:ascii="Arial Narrow" w:hAnsi="Arial Narrow"/>
+          <w:b/>
           <w:u w:val="single"/>
         </w:rPr>
-      </w:pPr>
+        <w:t xml:space="preserve">PERIODO </w:t>
+      </w:r>
       <w:r>
         <w:rPr>
           <w:rFonts w:ascii="Arial Narrow" w:hAnsi="Arial Narrow"/>
           <w:b/>
           <w:u w:val="single"/>
         </w:rPr>
-        <w:t xml:space="preserve">PERIODO </w:t>
+        <w:t>–</w:t>
       </w:r>
       <w:r>
         <w:rPr>
@@ -51,7 +58,7 @@
           <w:b/>
           <w:u w:val="single"/>
         </w:rPr>
-        <w:t>–</w:t>
+        <w:t xml:space="preserve"> </w:t>
       </w:r>
       <w:r>
         <w:rPr>
@@ -59,39 +66,25 @@
           <w:b/>
           <w:u w:val="single"/>
         </w:rPr>
-        <w:t xml:space="preserve"> </w:t>
-      </w:r>
+        <w:t>{</w:t>
+      </w:r>
+      <w:proofErr w:type="spellStart"/>
       <w:r>
         <w:rPr>
           <w:rFonts w:ascii="Arial Narrow" w:hAnsi="Arial Narrow"/>
           <w:b/>
           <w:u w:val="single"/>
         </w:rPr>
-        <w:t>mayo</w:t>
-      </w:r>
+        <w:t>mes_anio</w:t>
+      </w:r>
+      <w:proofErr w:type="spellEnd"/>
       <w:r>
         <w:rPr>
           <w:rFonts w:ascii="Arial Narrow" w:hAnsi="Arial Narrow"/>
           <w:b/>
           <w:u w:val="single"/>
         </w:rPr>
-        <w:t xml:space="preserve"> </w:t>
-      </w:r>
-      <w:r>
-        <w:rPr>
-          <w:rFonts w:ascii="Arial Narrow" w:hAnsi="Arial Narrow"/>
-          <w:b/>
-          <w:u w:val="single"/>
-        </w:rPr>
-        <w:t>202</w:t>
-      </w:r>
-      <w:r>
-        <w:rPr>
-          <w:rFonts w:ascii="Arial Narrow" w:hAnsi="Arial Narrow"/>
-          <w:b/>
-          <w:u w:val="single"/>
-        </w:rPr>
-        <w:t>5</w:t>
+        <w:t>}</w:t>
       </w:r>
     </w:p>
     <w:p>
@@ -1754,14 +1747,33 @@
         <w:rPr>
           <w:rFonts w:ascii="Arial Narrow" w:hAnsi="Arial Narrow"/>
           <w:b/>
-        </w:rPr>
-      </w:pPr>
-      <w:r>
-        <w:rPr>
-          <w:rFonts w:ascii="Arial Narrow" w:hAnsi="Arial Narrow"/>
-          <w:b/>
+          <w:sz w:val="28"/>
+          <w:szCs w:val="28"/>
+        </w:rPr>
+      </w:pPr>
+      <w:r>
+        <w:rPr>
+          <w:rFonts w:ascii="Arial Narrow" w:hAnsi="Arial Narrow"/>
+          <w:b/>
+          <w:sz w:val="28"/>
+          <w:szCs w:val="28"/>
         </w:rPr>
         <w:t xml:space="preserve">PROBLEMÁTICAS MÁS FRECUENTES </w:t>
+      </w:r>
+    </w:p>
+    <w:p>
+      <w:pPr>
+        <w:rPr>
+          <w:rFonts w:ascii="Arial Narrow" w:hAnsi="Arial Narrow"/>
+          <w:bCs/>
+        </w:rPr>
+      </w:pPr>
+      <w:r>
+        <w:rPr>
+          <w:rFonts w:ascii="Arial Narrow" w:hAnsi="Arial Narrow"/>
+          <w:bCs/>
+        </w:rPr>
+        <w:t>{#problematicas_frecuentes}</w:t>
       </w:r>
     </w:p>
     <w:p>
@@ -1779,194 +1791,279 @@
         <w:rPr>
           <w:rFonts w:ascii="Arial Narrow" w:hAnsi="Arial Narrow"/>
         </w:rPr>
-        <w:t>ESTADO DE ÁNIMO INESTABLE</w:t>
-      </w:r>
-      <w:r>
-        <w:rPr>
-          <w:rFonts w:ascii="Arial Narrow" w:hAnsi="Arial Narrow"/>
-        </w:rPr>
-        <w:t xml:space="preserve"> (</w:t>
-      </w:r>
-      <w:r>
-        <w:rPr>
-          <w:rFonts w:ascii="Arial Narrow" w:hAnsi="Arial Narrow"/>
-        </w:rPr>
-        <w:t>DEPRESIÓN</w:t>
-      </w:r>
-      <w:r>
-        <w:rPr>
-          <w:rFonts w:ascii="Arial Narrow" w:hAnsi="Arial Narrow"/>
-        </w:rPr>
-        <w:t>)</w:t>
+        <w:t>{</w:t>
+      </w:r>
+      <w:proofErr w:type="spellStart"/>
+      <w:r>
+        <w:rPr>
+          <w:rFonts w:ascii="Arial Narrow" w:hAnsi="Arial Narrow"/>
+        </w:rPr>
+        <w:t>problematica</w:t>
+      </w:r>
+      <w:proofErr w:type="spellEnd"/>
+      <w:r>
+        <w:rPr>
+          <w:rFonts w:ascii="Arial Narrow" w:hAnsi="Arial Narrow"/>
+        </w:rPr>
+        <w:t>}</w:t>
       </w:r>
     </w:p>
     <w:p>
       <w:pPr>
-        <w:pStyle w:val="Prrafodelista"/>
-        <w:numPr>
-          <w:ilvl w:val="0"/>
-          <w:numId w:val="1"/>
-        </w:numPr>
-        <w:rPr>
-          <w:rFonts w:ascii="Arial Narrow" w:hAnsi="Arial Narrow"/>
-        </w:rPr>
-      </w:pPr>
-      <w:r>
-        <w:rPr>
-          <w:rFonts w:ascii="Arial Narrow" w:hAnsi="Arial Narrow"/>
-        </w:rPr>
-        <w:t>ESTRÉS ACADÉMICO</w:t>
-      </w:r>
-      <w:r>
-        <w:rPr>
-          <w:rFonts w:ascii="Arial Narrow" w:hAnsi="Arial Narrow"/>
-        </w:rPr>
-        <w:t xml:space="preserve"> </w:t>
+        <w:rPr>
+          <w:rFonts w:ascii="Arial Narrow" w:hAnsi="Arial Narrow"/>
+          <w:bCs/>
+        </w:rPr>
+      </w:pPr>
+      <w:r>
+        <w:rPr>
+          <w:rFonts w:ascii="Arial Narrow" w:hAnsi="Arial Narrow"/>
+          <w:bCs/>
+        </w:rPr>
+        <w:t>{/</w:t>
+      </w:r>
+      <w:proofErr w:type="spellStart"/>
+      <w:r>
+        <w:rPr>
+          <w:rFonts w:ascii="Arial Narrow" w:hAnsi="Arial Narrow"/>
+          <w:bCs/>
+        </w:rPr>
+        <w:t>problematicas_frecuentes</w:t>
+      </w:r>
+      <w:proofErr w:type="spellEnd"/>
+      <w:r>
+        <w:rPr>
+          <w:rFonts w:ascii="Arial Narrow" w:hAnsi="Arial Narrow"/>
+          <w:bCs/>
+        </w:rPr>
+        <w:t>}</w:t>
       </w:r>
     </w:p>
     <w:p>
       <w:pPr>
-        <w:pStyle w:val="Prrafodelista"/>
-        <w:numPr>
-          <w:ilvl w:val="0"/>
-          <w:numId w:val="1"/>
-        </w:numPr>
-        <w:rPr>
-          <w:rFonts w:ascii="Arial Narrow" w:hAnsi="Arial Narrow"/>
-        </w:rPr>
-      </w:pPr>
-      <w:r>
-        <w:rPr>
-          <w:rFonts w:ascii="Arial Narrow" w:hAnsi="Arial Narrow"/>
-        </w:rPr>
-        <w:t>PROBLEMAS DE RENDIMIENTO ACADÉMICO</w:t>
-      </w:r>
+        <w:rPr>
+          <w:rFonts w:ascii="Arial Narrow" w:hAnsi="Arial Narrow"/>
+        </w:rPr>
+      </w:pPr>
     </w:p>
     <w:p>
       <w:pPr>
-        <w:pStyle w:val="Prrafodelista"/>
-        <w:numPr>
-          <w:ilvl w:val="0"/>
-          <w:numId w:val="1"/>
-        </w:numPr>
-        <w:rPr>
-          <w:rFonts w:ascii="Arial Narrow" w:hAnsi="Arial Narrow"/>
-        </w:rPr>
-      </w:pPr>
-      <w:r>
-        <w:rPr>
-          <w:rFonts w:ascii="Arial Narrow" w:hAnsi="Arial Narrow"/>
-        </w:rPr>
-        <w:t>BAJA AUTOESTIMA</w:t>
+        <w:rPr>
+          <w:rFonts w:ascii="Arial Narrow" w:hAnsi="Arial Narrow"/>
+          <w:b/>
+          <w:bCs/>
+          <w:sz w:val="28"/>
+          <w:szCs w:val="28"/>
+        </w:rPr>
+      </w:pPr>
+      <w:r>
+        <w:rPr>
+          <w:rFonts w:ascii="Arial Narrow" w:hAnsi="Arial Narrow"/>
+          <w:b/>
+          <w:bCs/>
+          <w:sz w:val="28"/>
+          <w:szCs w:val="28"/>
+        </w:rPr>
+        <w:t>REPORTE DE ACTIVIDADES REALIZADAS</w:t>
       </w:r>
     </w:p>
     <w:p>
       <w:pPr>
-        <w:pStyle w:val="Prrafodelista"/>
-        <w:numPr>
-          <w:ilvl w:val="0"/>
-          <w:numId w:val="1"/>
-        </w:numPr>
-        <w:rPr>
-          <w:rFonts w:ascii="Arial Narrow" w:hAnsi="Arial Narrow"/>
-        </w:rPr>
-      </w:pPr>
-      <w:r>
-        <w:rPr>
-          <w:rFonts w:ascii="Arial Narrow" w:hAnsi="Arial Narrow"/>
-        </w:rPr>
-        <w:t>ANSIEDAD</w:t>
+        <w:rPr>
+          <w:rFonts w:ascii="Arial Narrow" w:hAnsi="Arial Narrow"/>
+        </w:rPr>
+      </w:pPr>
+      <w:proofErr w:type="spellStart"/>
+      <w:r>
+        <w:rPr>
+          <w:rFonts w:ascii="Arial Narrow" w:hAnsi="Arial Narrow"/>
+          <w:b/>
+          <w:bCs/>
+        </w:rPr>
+        <w:lastRenderedPageBreak/>
+        <w:t>Numero</w:t>
+      </w:r>
+      <w:proofErr w:type="spellEnd"/>
+      <w:r>
+        <w:rPr>
+          <w:rFonts w:ascii="Arial Narrow" w:hAnsi="Arial Narrow"/>
+          <w:b/>
+          <w:bCs/>
+        </w:rPr>
+        <w:t xml:space="preserve"> total de actividades:</w:t>
+      </w:r>
+      <w:r>
+        <w:rPr>
+          <w:rFonts w:ascii="Arial Narrow" w:hAnsi="Arial Narrow"/>
+        </w:rPr>
+        <w:t xml:space="preserve"> {</w:t>
+      </w:r>
+      <w:proofErr w:type="spellStart"/>
+      <w:r>
+        <w:rPr>
+          <w:rFonts w:ascii="Arial Narrow" w:hAnsi="Arial Narrow"/>
+        </w:rPr>
+        <w:t>total_actividades</w:t>
+      </w:r>
+      <w:proofErr w:type="spellEnd"/>
+      <w:r>
+        <w:rPr>
+          <w:rFonts w:ascii="Arial Narrow" w:hAnsi="Arial Narrow"/>
+        </w:rPr>
+        <w:t>}</w:t>
       </w:r>
     </w:p>
     <w:p>
       <w:pPr>
-        <w:pStyle w:val="Prrafodelista"/>
-        <w:numPr>
-          <w:ilvl w:val="0"/>
-          <w:numId w:val="1"/>
-        </w:numPr>
-        <w:rPr>
-          <w:rFonts w:ascii="Arial Narrow" w:hAnsi="Arial Narrow"/>
-        </w:rPr>
-      </w:pPr>
-      <w:r>
-        <w:rPr>
-          <w:rFonts w:ascii="Arial Narrow" w:hAnsi="Arial Narrow"/>
-        </w:rPr>
-        <w:t xml:space="preserve">VIOLENCIA FAMILIAR </w:t>
+        <w:rPr>
+          <w:rFonts w:ascii="Arial Narrow" w:hAnsi="Arial Narrow"/>
+        </w:rPr>
+      </w:pPr>
+      <w:r>
+        <w:rPr>
+          <w:rFonts w:ascii="Arial Narrow" w:hAnsi="Arial Narrow"/>
+        </w:rPr>
+        <w:t>{#actividades}</w:t>
       </w:r>
     </w:p>
     <w:p>
       <w:pPr>
-        <w:pStyle w:val="Prrafodelista"/>
-        <w:numPr>
-          <w:ilvl w:val="0"/>
-          <w:numId w:val="1"/>
-        </w:numPr>
-        <w:rPr>
-          <w:rFonts w:ascii="Arial Narrow" w:hAnsi="Arial Narrow"/>
-        </w:rPr>
-      </w:pPr>
-      <w:r>
-        <w:rPr>
-          <w:rFonts w:ascii="Arial Narrow" w:hAnsi="Arial Narrow"/>
-        </w:rPr>
-        <w:t>INSEGURIDAD DE RENDIMIENTO ACADEMICO</w:t>
+        <w:rPr>
+          <w:rFonts w:ascii="Arial Narrow" w:hAnsi="Arial Narrow"/>
+        </w:rPr>
+      </w:pPr>
+      <w:r>
+        <w:rPr>
+          <w:rFonts w:ascii="Arial Narrow" w:hAnsi="Arial Narrow"/>
+          <w:b/>
+          <w:bCs/>
+        </w:rPr>
+        <w:t>TITULO:</w:t>
+      </w:r>
+      <w:r>
+        <w:rPr>
+          <w:rFonts w:ascii="Arial Narrow" w:hAnsi="Arial Narrow"/>
+        </w:rPr>
+        <w:t xml:space="preserve"> {</w:t>
+      </w:r>
+      <w:proofErr w:type="spellStart"/>
+      <w:r>
+        <w:rPr>
+          <w:rFonts w:ascii="Arial Narrow" w:hAnsi="Arial Narrow"/>
+        </w:rPr>
+        <w:t>titulo_act</w:t>
+      </w:r>
+      <w:proofErr w:type="spellEnd"/>
+      <w:r>
+        <w:rPr>
+          <w:rFonts w:ascii="Arial Narrow" w:hAnsi="Arial Narrow"/>
+        </w:rPr>
+        <w:t>}</w:t>
       </w:r>
     </w:p>
     <w:p>
       <w:pPr>
-        <w:pStyle w:val="Prrafodelista"/>
-        <w:numPr>
-          <w:ilvl w:val="0"/>
-          <w:numId w:val="1"/>
-        </w:numPr>
-        <w:rPr>
-          <w:rFonts w:ascii="Arial Narrow" w:hAnsi="Arial Narrow"/>
-        </w:rPr>
-      </w:pPr>
-      <w:r>
-        <w:rPr>
-          <w:rFonts w:ascii="Arial Narrow" w:hAnsi="Arial Narrow"/>
-        </w:rPr>
-        <w:t>PRESION FAMILIAR Y SOCIAL POR MANTENIMEINTO DE BECAS</w:t>
+        <w:rPr>
+          <w:rFonts w:ascii="Arial Narrow" w:hAnsi="Arial Narrow"/>
+        </w:rPr>
+      </w:pPr>
+      <w:r>
+        <w:rPr>
+          <w:rFonts w:ascii="Arial Narrow" w:hAnsi="Arial Narrow"/>
+          <w:b/>
+          <w:bCs/>
+        </w:rPr>
+        <w:t>PSICOLOGO A CARGO:</w:t>
+      </w:r>
+      <w:r>
+        <w:rPr>
+          <w:rFonts w:ascii="Arial Narrow" w:hAnsi="Arial Narrow"/>
+        </w:rPr>
+        <w:t xml:space="preserve"> {</w:t>
+      </w:r>
+      <w:proofErr w:type="spellStart"/>
+      <w:r>
+        <w:rPr>
+          <w:rFonts w:ascii="Arial Narrow" w:hAnsi="Arial Narrow"/>
+        </w:rPr>
+        <w:t>psicologo_act</w:t>
+      </w:r>
+      <w:proofErr w:type="spellEnd"/>
+      <w:r>
+        <w:rPr>
+          <w:rFonts w:ascii="Arial Narrow" w:hAnsi="Arial Narrow"/>
+        </w:rPr>
+        <w:t>}</w:t>
       </w:r>
     </w:p>
     <w:p>
       <w:pPr>
-        <w:pStyle w:val="Prrafodelista"/>
-        <w:numPr>
-          <w:ilvl w:val="0"/>
-          <w:numId w:val="1"/>
-        </w:numPr>
-        <w:rPr>
-          <w:rFonts w:ascii="Arial Narrow" w:hAnsi="Arial Narrow"/>
-        </w:rPr>
-      </w:pPr>
-      <w:r>
-        <w:rPr>
-          <w:rFonts w:ascii="Arial Narrow" w:hAnsi="Arial Narrow"/>
-        </w:rPr>
-        <w:lastRenderedPageBreak/>
-        <w:t>SEGUIMIENTO A BECAS</w:t>
+        <w:rPr>
+          <w:rFonts w:ascii="Arial Narrow" w:hAnsi="Arial Narrow"/>
+        </w:rPr>
+      </w:pPr>
+      <w:r>
+        <w:rPr>
+          <w:rFonts w:ascii="Arial Narrow" w:hAnsi="Arial Narrow"/>
+          <w:b/>
+          <w:bCs/>
+        </w:rPr>
+        <w:t>FECHA DE INICIO:</w:t>
+      </w:r>
+      <w:r>
+        <w:rPr>
+          <w:rFonts w:ascii="Arial Narrow" w:hAnsi="Arial Narrow"/>
+        </w:rPr>
+        <w:t xml:space="preserve"> {</w:t>
+      </w:r>
+      <w:proofErr w:type="spellStart"/>
+      <w:r>
+        <w:rPr>
+          <w:rFonts w:ascii="Arial Narrow" w:hAnsi="Arial Narrow"/>
+        </w:rPr>
+        <w:t>fecha_inicio_act</w:t>
+      </w:r>
+      <w:proofErr w:type="spellEnd"/>
+      <w:r>
+        <w:rPr>
+          <w:rFonts w:ascii="Arial Narrow" w:hAnsi="Arial Narrow"/>
+        </w:rPr>
+        <w:t>}</w:t>
       </w:r>
     </w:p>
     <w:p>
       <w:pPr>
-        <w:pStyle w:val="Prrafodelista"/>
-        <w:numPr>
-          <w:ilvl w:val="0"/>
-          <w:numId w:val="1"/>
-        </w:numPr>
-        <w:rPr>
-          <w:rFonts w:ascii="Arial Narrow" w:hAnsi="Arial Narrow"/>
-        </w:rPr>
-      </w:pPr>
-      <w:r>
-        <w:rPr>
-          <w:rFonts w:ascii="Arial Narrow" w:hAnsi="Arial Narrow"/>
-        </w:rPr>
-        <w:t>ORIENTACION VOCACIONAL</w:t>
+        <w:rPr>
+          <w:rFonts w:ascii="Arial Narrow" w:hAnsi="Arial Narrow"/>
+        </w:rPr>
+      </w:pPr>
+      <w:r>
+        <w:rPr>
+          <w:rFonts w:ascii="Arial Narrow" w:hAnsi="Arial Narrow"/>
+          <w:b/>
+          <w:bCs/>
+        </w:rPr>
+        <w:t>FECHA DE FINALIZACION:</w:t>
+      </w:r>
+      <w:r>
+        <w:rPr>
+          <w:rFonts w:ascii="Arial Narrow" w:hAnsi="Arial Narrow"/>
+        </w:rPr>
+        <w:t xml:space="preserve"> {</w:t>
+      </w:r>
+      <w:proofErr w:type="spellStart"/>
+      <w:r>
+        <w:rPr>
+          <w:rFonts w:ascii="Arial Narrow" w:hAnsi="Arial Narrow"/>
+        </w:rPr>
+        <w:t>fecha_fin_act</w:t>
+      </w:r>
+      <w:proofErr w:type="spellEnd"/>
+      <w:r>
+        <w:rPr>
+          <w:rFonts w:ascii="Arial Narrow" w:hAnsi="Arial Narrow"/>
+        </w:rPr>
+        <w:t>}</w:t>
       </w:r>
     </w:p>
     <w:p>
@@ -1981,27 +2078,27 @@
           <w:b/>
           <w:bCs/>
         </w:rPr>
-        <w:t xml:space="preserve">TALLER SOBRE INTELIGENCIA EMOCIONAL </w:t>
-      </w:r>
-      <w:r>
-        <w:rPr>
-          <w:rFonts w:ascii="Arial Narrow" w:hAnsi="Arial Narrow"/>
-        </w:rPr>
-        <w:t xml:space="preserve">EN FECHA 28 /04/2025 De </w:t>
+        <w:t>OBJETIVO:</w:t>
+      </w:r>
+      <w:r>
+        <w:rPr>
+          <w:rFonts w:ascii="Arial Narrow" w:hAnsi="Arial Narrow"/>
+        </w:rPr>
+        <w:t xml:space="preserve"> {</w:t>
       </w:r>
       <w:proofErr w:type="spellStart"/>
       <w:r>
         <w:rPr>
           <w:rFonts w:ascii="Arial Narrow" w:hAnsi="Arial Narrow"/>
         </w:rPr>
-        <w:t>hrs</w:t>
+        <w:t>objetivo_act</w:t>
       </w:r>
       <w:proofErr w:type="spellEnd"/>
       <w:r>
         <w:rPr>
           <w:rFonts w:ascii="Arial Narrow" w:hAnsi="Arial Narrow"/>
         </w:rPr>
-        <w:t xml:space="preserve"> 5:45 a 7:15 pm</w:t>
+        <w:t>}</w:t>
       </w:r>
     </w:p>
     <w:p>
@@ -2016,27 +2113,27 @@
           <w:b/>
           <w:bCs/>
         </w:rPr>
-        <w:t>Objetivo de la actividad:</w:t>
-      </w:r>
-      <w:r>
-        <w:rPr>
-          <w:rFonts w:ascii="Arial Narrow" w:hAnsi="Arial Narrow"/>
-        </w:rPr>
-        <w:t xml:space="preserve"> El principal objetivo de trabajar la inteligencia emocional es </w:t>
-      </w:r>
-      <w:r>
-        <w:rPr>
-          <w:rFonts w:ascii="Arial Narrow" w:hAnsi="Arial Narrow"/>
-          <w:b/>
-          <w:bCs/>
-        </w:rPr>
-        <w:t>mejorar la capacidad de reconocer, comprender, manejar y expresar adecuadamente las propias emociones y las de los demás</w:t>
-      </w:r>
-      <w:r>
-        <w:rPr>
-          <w:rFonts w:ascii="Arial Narrow" w:hAnsi="Arial Narrow"/>
-        </w:rPr>
-        <w:t>, con el fin de lograr relaciones más saludables, una mejor toma de decisiones y mayor bienestar personal y profesional.</w:t>
+        <w:t>POBLACION:</w:t>
+      </w:r>
+      <w:r>
+        <w:rPr>
+          <w:rFonts w:ascii="Arial Narrow" w:hAnsi="Arial Narrow"/>
+        </w:rPr>
+        <w:t xml:space="preserve"> {</w:t>
+      </w:r>
+      <w:proofErr w:type="spellStart"/>
+      <w:r>
+        <w:rPr>
+          <w:rFonts w:ascii="Arial Narrow" w:hAnsi="Arial Narrow"/>
+        </w:rPr>
+        <w:t>poblacion_act</w:t>
+      </w:r>
+      <w:proofErr w:type="spellEnd"/>
+      <w:r>
+        <w:rPr>
+          <w:rFonts w:ascii="Arial Narrow" w:hAnsi="Arial Narrow"/>
+        </w:rPr>
+        <w:t>}</w:t>
       </w:r>
     </w:p>
     <w:p>
@@ -2051,178 +2148,206 @@
           <w:b/>
           <w:bCs/>
         </w:rPr>
-        <w:t>Población:</w:t>
-      </w:r>
-      <w:r>
-        <w:rPr>
-          <w:rFonts w:ascii="Arial Narrow" w:hAnsi="Arial Narrow"/>
-        </w:rPr>
-        <w:t xml:space="preserve"> Estudiantes de 5to semestre de la Carrera de Ingeniería en sistemas.</w:t>
+        <w:t>NUMERO DE ASISTENTES:</w:t>
+      </w:r>
+      <w:r>
+        <w:rPr>
+          <w:rFonts w:ascii="Arial Narrow" w:hAnsi="Arial Narrow"/>
+        </w:rPr>
+        <w:t xml:space="preserve"> {</w:t>
+      </w:r>
+      <w:proofErr w:type="spellStart"/>
+      <w:r>
+        <w:rPr>
+          <w:rFonts w:ascii="Arial Narrow" w:hAnsi="Arial Narrow"/>
+        </w:rPr>
+        <w:t>asistentes_act</w:t>
+      </w:r>
+      <w:proofErr w:type="spellEnd"/>
+      <w:r>
+        <w:rPr>
+          <w:rFonts w:ascii="Arial Narrow" w:hAnsi="Arial Narrow"/>
+        </w:rPr>
+        <w:t>}</w:t>
       </w:r>
     </w:p>
     <w:p>
       <w:pPr>
         <w:rPr>
           <w:rFonts w:ascii="Arial Narrow" w:hAnsi="Arial Narrow"/>
+        </w:rPr>
+      </w:pPr>
+      <w:r>
+        <w:rPr>
+          <w:rFonts w:ascii="Arial Narrow" w:hAnsi="Arial Narrow"/>
           <w:b/>
           <w:bCs/>
         </w:rPr>
-      </w:pPr>
-      <w:r>
-        <w:rPr>
-          <w:rFonts w:ascii="Arial Narrow" w:hAnsi="Arial Narrow"/>
-          <w:b/>
-          <w:bCs/>
-        </w:rPr>
-        <w:t>ATENCIÓN DE ORIENTACIONES VOCACIONALES</w:t>
+        <w:t>RESUMEN DE LA ACTIVIDIDAD:</w:t>
+      </w:r>
+      <w:r>
+        <w:rPr>
+          <w:rFonts w:ascii="Arial Narrow" w:hAnsi="Arial Narrow"/>
+        </w:rPr>
+        <w:t xml:space="preserve"> {</w:t>
+      </w:r>
+      <w:proofErr w:type="spellStart"/>
+      <w:r>
+        <w:rPr>
+          <w:rFonts w:ascii="Arial Narrow" w:hAnsi="Arial Narrow"/>
+        </w:rPr>
+        <w:t>resumen_act</w:t>
+      </w:r>
+      <w:proofErr w:type="spellEnd"/>
+      <w:r>
+        <w:rPr>
+          <w:rFonts w:ascii="Arial Narrow" w:hAnsi="Arial Narrow"/>
+        </w:rPr>
+        <w:t>}</w:t>
       </w:r>
     </w:p>
     <w:p>
       <w:pPr>
-        <w:pStyle w:val="Prrafodelista"/>
-        <w:numPr>
-          <w:ilvl w:val="0"/>
-          <w:numId w:val="9"/>
-        </w:numPr>
-        <w:rPr>
-          <w:rFonts w:ascii="Arial Narrow" w:hAnsi="Arial Narrow"/>
-          <w:lang w:val="es-BO"/>
-        </w:rPr>
-      </w:pPr>
-      <w:r>
-        <w:rPr>
-          <w:rFonts w:ascii="Arial Narrow" w:hAnsi="Arial Narrow"/>
-          <w:lang w:val="es-BO"/>
-        </w:rPr>
-        <w:t>Reunión con el Lic. Fridel y la Lic. Verónica Chamón para la revisión y ajuste de los test de orientación vocacional a implementarse en los colegios (24/04/2025).</w:t>
+        <w:rPr>
+          <w:rFonts w:ascii="Arial Narrow" w:hAnsi="Arial Narrow"/>
+        </w:rPr>
+      </w:pPr>
+      <w:r>
+        <w:rPr>
+          <w:rFonts w:ascii="Arial Narrow" w:hAnsi="Arial Narrow"/>
+          <w:b/>
+          <w:bCs/>
+        </w:rPr>
+        <w:t>RESULTADOS:</w:t>
+      </w:r>
+      <w:r>
+        <w:rPr>
+          <w:rFonts w:ascii="Arial Narrow" w:hAnsi="Arial Narrow"/>
+        </w:rPr>
+        <w:t xml:space="preserve"> {</w:t>
+      </w:r>
+      <w:proofErr w:type="spellStart"/>
+      <w:r>
+        <w:rPr>
+          <w:rFonts w:ascii="Arial Narrow" w:hAnsi="Arial Narrow"/>
+        </w:rPr>
+        <w:t>resultados_act</w:t>
+      </w:r>
+      <w:proofErr w:type="spellEnd"/>
+      <w:r>
+        <w:rPr>
+          <w:rFonts w:ascii="Arial Narrow" w:hAnsi="Arial Narrow"/>
+        </w:rPr>
+        <w:t>}</w:t>
       </w:r>
     </w:p>
     <w:p>
       <w:pPr>
-        <w:pStyle w:val="Prrafodelista"/>
-        <w:numPr>
-          <w:ilvl w:val="0"/>
-          <w:numId w:val="9"/>
-        </w:numPr>
-        <w:rPr>
-          <w:rFonts w:ascii="Arial Narrow" w:hAnsi="Arial Narrow"/>
-          <w:lang w:val="es-BO"/>
-        </w:rPr>
-      </w:pPr>
-      <w:r>
-        <w:rPr>
-          <w:rFonts w:ascii="Arial Narrow" w:hAnsi="Arial Narrow"/>
-          <w:lang w:val="es-BO"/>
-        </w:rPr>
-        <w:t>Reunión con el Departamento de Marketing para coordinar mejoras en la presentación de los informes de orientación vocacional (29/04/2025).</w:t>
+        <w:rPr>
+          <w:rFonts w:ascii="Arial Narrow" w:hAnsi="Arial Narrow"/>
+        </w:rPr>
+      </w:pPr>
+      <w:r>
+        <w:rPr>
+          <w:rFonts w:ascii="Arial Narrow" w:hAnsi="Arial Narrow"/>
+          <w:b/>
+          <w:bCs/>
+        </w:rPr>
+        <w:t>EVIDENCIAS:</w:t>
+      </w:r>
+      <w:r>
+        <w:rPr>
+          <w:rFonts w:ascii="Arial Narrow" w:hAnsi="Arial Narrow"/>
+        </w:rPr>
+        <w:br/>
+      </w:r>
+      <w:r>
+        <w:rPr>
+          <w:rFonts w:ascii="Arial Narrow" w:hAnsi="Arial Narrow"/>
+        </w:rPr>
+        <w:t>{#evidencias_img}</w:t>
       </w:r>
     </w:p>
     <w:p>
       <w:pPr>
-        <w:pStyle w:val="Prrafodelista"/>
-        <w:numPr>
-          <w:ilvl w:val="0"/>
-          <w:numId w:val="9"/>
-        </w:numPr>
-        <w:rPr>
-          <w:rFonts w:ascii="Arial Narrow" w:hAnsi="Arial Narrow"/>
-          <w:lang w:val="es-BO"/>
-        </w:rPr>
-      </w:pPr>
-      <w:r>
-        <w:rPr>
-          <w:rFonts w:ascii="Arial Narrow" w:hAnsi="Arial Narrow"/>
-          <w:lang w:val="es-BO"/>
-        </w:rPr>
-        <w:t>Reunión con la Lic. Fabiana Sfarcich y la Lic. Verónica Chamón para coordinar acciones de orientación vocacional dirigidas a los colegios Fe y Alegría.</w:t>
+        <w:rPr>
+          <w:rFonts w:ascii="Arial Narrow" w:hAnsi="Arial Narrow"/>
+        </w:rPr>
+      </w:pPr>
+      <w:r>
+        <w:rPr>
+          <w:rFonts w:ascii="Arial Narrow" w:hAnsi="Arial Narrow"/>
+        </w:rPr>
+        <w:t>{%</w:t>
+      </w:r>
+      <w:proofErr w:type="spellStart"/>
+      <w:r>
+        <w:rPr>
+          <w:rFonts w:ascii="Arial Narrow" w:hAnsi="Arial Narrow"/>
+        </w:rPr>
+        <w:t>img</w:t>
+      </w:r>
+      <w:proofErr w:type="spellEnd"/>
+      <w:r>
+        <w:rPr>
+          <w:rFonts w:ascii="Arial Narrow" w:hAnsi="Arial Narrow"/>
+        </w:rPr>
+        <w:t>}</w:t>
       </w:r>
     </w:p>
     <w:p>
       <w:pPr>
-        <w:pStyle w:val="Prrafodelista"/>
-        <w:numPr>
-          <w:ilvl w:val="0"/>
-          <w:numId w:val="9"/>
-        </w:numPr>
-        <w:rPr>
-          <w:rFonts w:ascii="Arial Narrow" w:hAnsi="Arial Narrow"/>
-          <w:lang w:val="es-BO"/>
-        </w:rPr>
-      </w:pPr>
-      <w:r>
-        <w:rPr>
-          <w:rFonts w:ascii="Arial Narrow" w:hAnsi="Arial Narrow"/>
-          <w:lang w:val="es-BO"/>
-        </w:rPr>
-        <w:t>Reunión con los directores de los colegios Fe y Alegría para la planificación de actividades de orientación vocacional.</w:t>
+        <w:rPr>
+          <w:rFonts w:ascii="Arial Narrow" w:hAnsi="Arial Narrow"/>
+        </w:rPr>
+      </w:pPr>
+      <w:r>
+        <w:rPr>
+          <w:rFonts w:ascii="Arial Narrow" w:hAnsi="Arial Narrow"/>
+        </w:rPr>
+        <w:t>{/</w:t>
+      </w:r>
+      <w:proofErr w:type="spellStart"/>
+      <w:r>
+        <w:rPr>
+          <w:rFonts w:ascii="Arial Narrow" w:hAnsi="Arial Narrow"/>
+        </w:rPr>
+        <w:t>evidencias_img</w:t>
+      </w:r>
+      <w:proofErr w:type="spellEnd"/>
+      <w:r>
+        <w:rPr>
+          <w:rFonts w:ascii="Arial Narrow" w:hAnsi="Arial Narrow"/>
+        </w:rPr>
+        <w:t>}</w:t>
       </w:r>
     </w:p>
     <w:p>
       <w:pPr>
-        <w:pStyle w:val="Prrafodelista"/>
-        <w:numPr>
-          <w:ilvl w:val="0"/>
-          <w:numId w:val="9"/>
-        </w:numPr>
-        <w:rPr>
-          <w:rFonts w:ascii="Arial Narrow" w:hAnsi="Arial Narrow"/>
-          <w:lang w:val="es-BO"/>
-        </w:rPr>
-      </w:pPr>
-      <w:r>
-        <w:rPr>
-          <w:rFonts w:ascii="Arial Narrow" w:hAnsi="Arial Narrow"/>
-          <w:lang w:val="es-BO"/>
-        </w:rPr>
-        <w:t>Reuniones periódicas con el Lic. Fidel Baldiviezo para coordinar aspectos técnicos y operativos relacionados con los test de orientación vocacional.</w:t>
+        <w:rPr>
+          <w:rFonts w:ascii="Arial Narrow" w:hAnsi="Arial Narrow"/>
+        </w:rPr>
+      </w:pPr>
+      <w:r>
+        <w:rPr>
+          <w:rFonts w:ascii="Arial Narrow" w:hAnsi="Arial Narrow"/>
+        </w:rPr>
+        <w:t>{/actividades}</w:t>
       </w:r>
     </w:p>
     <w:p>
       <w:pPr>
         <w:rPr>
           <w:rFonts w:ascii="Arial Narrow" w:hAnsi="Arial Narrow"/>
-          <w:b/>
-          <w:bCs/>
-          <w:lang w:val="es-BO"/>
-        </w:rPr>
-      </w:pPr>
-      <w:r>
-        <w:rPr>
-          <w:rFonts w:ascii="Arial Narrow" w:hAnsi="Arial Narrow"/>
-          <w:b/>
-          <w:bCs/>
-          <w:lang w:val="es-BO"/>
-        </w:rPr>
-        <w:t>Apoyo para la Carrera de Psicología</w:t>
-      </w:r>
+        </w:rPr>
+      </w:pPr>
     </w:p>
     <w:p>
       <w:pPr>
-        <w:numPr>
-          <w:ilvl w:val="0"/>
-          <w:numId w:val="10"/>
-        </w:numPr>
-        <w:rPr>
-          <w:rFonts w:ascii="Arial Narrow" w:hAnsi="Arial Narrow"/>
-          <w:lang w:val="es-BO"/>
-        </w:rPr>
-      </w:pPr>
-      <w:r>
-        <w:rPr>
-          <w:rFonts w:ascii="Arial Narrow" w:hAnsi="Arial Narrow"/>
-          <w:b/>
-          <w:bCs/>
-          <w:lang w:val="es-BO"/>
-        </w:rPr>
-        <w:t>04/04/2025:</w:t>
-      </w:r>
-      <w:r>
-        <w:rPr>
-          <w:rFonts w:ascii="Arial Narrow" w:hAnsi="Arial Narrow"/>
-          <w:lang w:val="es-BO"/>
-        </w:rPr>
-        <w:t xml:space="preserve"> Reunión con el Lic. Juan Carlos Aldunate para coordinar actividades en el marco del Mes de la Familia.</w:t>
-      </w:r>
+        <w:rPr>
+          <w:rFonts w:ascii="Arial Narrow" w:hAnsi="Arial Narrow"/>
+        </w:rPr>
+      </w:pPr>
     </w:p>
     <w:p>
       <w:pPr>
@@ -2242,41 +2367,34 @@
       <w:pPr>
         <w:rPr>
           <w:rFonts w:ascii="Arial Narrow" w:hAnsi="Arial Narrow"/>
+          <w:b/>
+          <w:bCs/>
         </w:rPr>
       </w:pPr>
     </w:p>
     <w:p>
       <w:pPr>
-        <w:rPr>
-          <w:rFonts w:ascii="Arial Narrow" w:hAnsi="Arial Narrow"/>
-        </w:rPr>
-      </w:pPr>
+        <w:jc w:val="center"/>
+        <w:rPr>
+          <w:rFonts w:ascii="Arial Narrow" w:hAnsi="Arial Narrow"/>
+        </w:rPr>
+      </w:pPr>
+      <w:r>
+        <w:rPr>
+          <w:rFonts w:ascii="Arial Narrow" w:hAnsi="Arial Narrow"/>
+        </w:rPr>
+        <w:lastRenderedPageBreak/>
+        <w:t xml:space="preserve">Lic. </w:t>
+      </w:r>
+      <w:r>
+        <w:rPr>
+          <w:rFonts w:ascii="Arial Narrow" w:hAnsi="Arial Narrow"/>
+        </w:rPr>
+        <w:t>Psi. Franz Reynaldo Loayza Marquez</w:t>
+      </w:r>
     </w:p>
     <w:p>
       <w:pPr>
-        <w:rPr>
-          <w:rFonts w:ascii="Arial Narrow" w:hAnsi="Arial Narrow"/>
-        </w:rPr>
-      </w:pPr>
-    </w:p>
-    <w:p>
-      <w:pPr>
-        <w:rPr>
-          <w:rFonts w:ascii="Arial Narrow" w:hAnsi="Arial Narrow"/>
-        </w:rPr>
-      </w:pPr>
-    </w:p>
-    <w:p>
-      <w:pPr>
-        <w:rPr>
-          <w:rFonts w:ascii="Arial Narrow" w:hAnsi="Arial Narrow"/>
-          <w:b/>
-          <w:bCs/>
-        </w:rPr>
-      </w:pPr>
-    </w:p>
-    <w:p>
-      <w:pPr>
         <w:jc w:val="center"/>
         <w:rPr>
           <w:rFonts w:ascii="Arial Narrow" w:hAnsi="Arial Narrow"/>
@@ -2286,27 +2404,6 @@
         <w:rPr>
           <w:rFonts w:ascii="Arial Narrow" w:hAnsi="Arial Narrow"/>
         </w:rPr>
-        <w:t xml:space="preserve">Lic. </w:t>
-      </w:r>
-      <w:r>
-        <w:rPr>
-          <w:rFonts w:ascii="Arial Narrow" w:hAnsi="Arial Narrow"/>
-        </w:rPr>
-        <w:t>Psi. Franz Reynaldo Loayza Marquez</w:t>
-      </w:r>
-    </w:p>
-    <w:p>
-      <w:pPr>
-        <w:jc w:val="center"/>
-        <w:rPr>
-          <w:rFonts w:ascii="Arial Narrow" w:hAnsi="Arial Narrow"/>
-        </w:rPr>
-      </w:pPr>
-      <w:r>
-        <w:rPr>
-          <w:rFonts w:ascii="Arial Narrow" w:hAnsi="Arial Narrow"/>
-        </w:rPr>
-        <w:lastRenderedPageBreak/>
         <w:t>Psicólog</w:t>
       </w:r>
       <w:r>
@@ -3954,7 +4051,7 @@
   <w:style w:type="paragraph" w:default="1" w:styleId="Normal">
     <w:name w:val="Normal"/>
     <w:qFormat/>
-    <w:rsid w:val="002C7F29"/>
+    <w:rsid w:val="00054105"/>
     <w:rPr>
       <w:lang w:val="es-ES"/>
     </w:rPr>
@@ -3982,7 +4079,6 @@
   <w:style w:type="character" w:default="1" w:styleId="Fuentedeprrafopredeter">
     <w:name w:val="Default Paragraph Font"/>
     <w:uiPriority w:val="1"/>
-    <w:semiHidden/>
     <w:unhideWhenUsed/>
   </w:style>
   <w:style w:type="table" w:default="1" w:styleId="Tablanormal">
@@ -4150,6 +4246,37 @@
     <w:rPr>
       <w:b/>
       <w:bCs/>
+    </w:rPr>
+  </w:style>
+  <w:style w:type="paragraph" w:styleId="HTMLconformatoprevio">
+    <w:name w:val="HTML Preformatted"/>
+    <w:basedOn w:val="Normal"/>
+    <w:link w:val="HTMLconformatoprevioCar"/>
+    <w:uiPriority w:val="99"/>
+    <w:semiHidden/>
+    <w:unhideWhenUsed/>
+    <w:rsid w:val="00A678B4"/>
+    <w:pPr>
+      <w:spacing w:after="0" w:line="240" w:lineRule="auto"/>
+    </w:pPr>
+    <w:rPr>
+      <w:rFonts w:ascii="Consolas" w:hAnsi="Consolas"/>
+      <w:sz w:val="20"/>
+      <w:szCs w:val="20"/>
+    </w:rPr>
+  </w:style>
+  <w:style w:type="character" w:customStyle="1" w:styleId="HTMLconformatoprevioCar">
+    <w:name w:val="HTML con formato previo Car"/>
+    <w:basedOn w:val="Fuentedeprrafopredeter"/>
+    <w:link w:val="HTMLconformatoprevio"/>
+    <w:uiPriority w:val="99"/>
+    <w:semiHidden/>
+    <w:rsid w:val="00A678B4"/>
+    <w:rPr>
+      <w:rFonts w:ascii="Consolas" w:hAnsi="Consolas"/>
+      <w:sz w:val="20"/>
+      <w:szCs w:val="20"/>
+      <w:lang w:val="es-ES"/>
     </w:rPr>
   </w:style>
 </w:styles>

</xml_diff>

<commit_message>
added new export dashboard button and fixed some charts
</commit_message>
<xml_diff>
--- a/public/plantilla-reporte.docx
+++ b/public/plantilla-reporte.docx
@@ -66,25 +66,7 @@
           <w:b/>
           <w:u w:val="single"/>
         </w:rPr>
-        <w:t>{</w:t>
-      </w:r>
-      <w:proofErr w:type="spellStart"/>
-      <w:r>
-        <w:rPr>
-          <w:rFonts w:ascii="Arial Narrow" w:hAnsi="Arial Narrow"/>
-          <w:b/>
-          <w:u w:val="single"/>
-        </w:rPr>
-        <w:t>mes_anio</w:t>
-      </w:r>
-      <w:proofErr w:type="spellEnd"/>
-      <w:r>
-        <w:rPr>
-          <w:rFonts w:ascii="Arial Narrow" w:hAnsi="Arial Narrow"/>
-          <w:b/>
-          <w:u w:val="single"/>
-        </w:rPr>
-        <w:t>}</w:t>
+        <w:t>{mes_anio}</w:t>
       </w:r>
     </w:p>
     <w:p>
@@ -170,47 +152,25 @@
         </w:rPr>
         <w:t xml:space="preserve">ic. </w:t>
       </w:r>
-      <w:r>
-        <w:rPr>
-          <w:rFonts w:ascii="Arial Narrow" w:hAnsi="Arial Narrow"/>
-        </w:rPr>
-        <w:t xml:space="preserve">Psi. </w:t>
-      </w:r>
-      <w:r>
-        <w:rPr>
-          <w:rFonts w:ascii="Arial Narrow" w:hAnsi="Arial Narrow"/>
-        </w:rPr>
-        <w:t>Franz Reynaldo Loayza Marquez</w:t>
-      </w:r>
-      <w:r>
-        <w:rPr>
-          <w:rFonts w:ascii="Arial Narrow" w:hAnsi="Arial Narrow"/>
-        </w:rPr>
-        <w:t xml:space="preserve"> Psicólog</w:t>
-      </w:r>
-      <w:r>
-        <w:rPr>
-          <w:rFonts w:ascii="Arial Narrow" w:hAnsi="Arial Narrow"/>
-        </w:rPr>
-        <w:t>o</w:t>
-      </w:r>
-      <w:r>
-        <w:rPr>
-          <w:rFonts w:ascii="Arial Narrow" w:hAnsi="Arial Narrow"/>
-        </w:rPr>
-        <w:t xml:space="preserve"> Acompañamiento psicológico</w:t>
-      </w:r>
-      <w:r>
-        <w:rPr>
-          <w:rFonts w:ascii="Arial Narrow" w:hAnsi="Arial Narrow"/>
-        </w:rPr>
-        <w:t xml:space="preserve"> </w:t>
-      </w:r>
-      <w:r>
-        <w:rPr>
-          <w:rFonts w:ascii="Arial Narrow" w:hAnsi="Arial Narrow"/>
-        </w:rPr>
-        <w:t>UCB</w:t>
+      <w:proofErr w:type="gramStart"/>
+      <w:r>
+        <w:rPr>
+          <w:rFonts w:ascii="Arial Narrow" w:hAnsi="Arial Narrow"/>
+        </w:rPr>
+        <w:t>Psi.</w:t>
+      </w:r>
+      <w:r>
+        <w:rPr>
+          <w:rFonts w:ascii="Arial Narrow" w:hAnsi="Arial Narrow"/>
+        </w:rPr>
+        <w:t>{</w:t>
+      </w:r>
+      <w:proofErr w:type="gramEnd"/>
+      <w:r>
+        <w:rPr>
+          <w:rFonts w:ascii="Arial Narrow" w:hAnsi="Arial Narrow"/>
+        </w:rPr>
+        <w:t>nombre_psicologo}</w:t>
       </w:r>
     </w:p>
     <w:p>
@@ -510,23 +470,7 @@
           <w:rFonts w:ascii="Arial Narrow" w:hAnsi="Arial Narrow"/>
           <w:b/>
         </w:rPr>
-        <w:t>{</w:t>
-      </w:r>
-      <w:proofErr w:type="spellStart"/>
-      <w:r>
-        <w:rPr>
-          <w:rFonts w:ascii="Arial Narrow" w:hAnsi="Arial Narrow"/>
-          <w:b/>
-        </w:rPr>
-        <w:t>total_acompanamiento</w:t>
-      </w:r>
-      <w:proofErr w:type="spellEnd"/>
-      <w:r>
-        <w:rPr>
-          <w:rFonts w:ascii="Arial Narrow" w:hAnsi="Arial Narrow"/>
-          <w:b/>
-        </w:rPr>
-        <w:t>}</w:t>
+        <w:t>{total_acompanamiento}</w:t>
       </w:r>
       <w:r>
         <w:rPr>
@@ -568,16 +512,50 @@
           <w:rFonts w:ascii="Arial Narrow" w:hAnsi="Arial Narrow"/>
           <w:b/>
         </w:rPr>
+        <w:t xml:space="preserve">     </w:t>
+      </w:r>
+      <w:r>
+        <w:rPr>
+          <w:rFonts w:ascii="Arial Narrow" w:hAnsi="Arial Narrow"/>
+          <w:b/>
+        </w:rPr>
+        <w:t xml:space="preserve"> </w:t>
+      </w:r>
+      <w:r>
+        <w:rPr>
+          <w:rFonts w:ascii="Arial Narrow" w:hAnsi="Arial Narrow"/>
+          <w:b/>
+        </w:rPr>
+        <w:t>{total_buen_proceso}</w:t>
+      </w:r>
+      <w:r>
+        <w:rPr>
+          <w:rFonts w:ascii="Arial Narrow" w:hAnsi="Arial Narrow"/>
+          <w:b/>
+        </w:rPr>
+        <w:t xml:space="preserve"> </w:t>
+      </w:r>
+      <w:r>
+        <w:rPr>
+          <w:rFonts w:ascii="Arial Narrow" w:hAnsi="Arial Narrow"/>
+          <w:b/>
+        </w:rPr>
+        <w:t xml:space="preserve">estudiantes </w:t>
+      </w:r>
+      <w:r>
+        <w:rPr>
+          <w:rFonts w:ascii="Arial Narrow" w:hAnsi="Arial Narrow"/>
+          <w:b/>
+        </w:rPr>
+        <w:t xml:space="preserve">             </w:t>
+      </w:r>
+      <w:r>
+        <w:rPr>
+          <w:rFonts w:ascii="Arial Narrow" w:hAnsi="Arial Narrow"/>
+          <w:b/>
+        </w:rPr>
         <w:t xml:space="preserve">   </w:t>
       </w:r>
-      <w:proofErr w:type="gramStart"/>
-      <w:r>
-        <w:rPr>
-          <w:rFonts w:ascii="Arial Narrow" w:hAnsi="Arial Narrow"/>
-          <w:b/>
-        </w:rPr>
-        <w:t xml:space="preserve">  </w:t>
-      </w:r>
       <w:r>
         <w:rPr>
           <w:rFonts w:ascii="Arial Narrow" w:hAnsi="Arial Narrow"/>
@@ -590,65 +568,6 @@
           <w:rFonts w:ascii="Arial Narrow" w:hAnsi="Arial Narrow"/>
           <w:b/>
         </w:rPr>
-        <w:t>{</w:t>
-      </w:r>
-      <w:proofErr w:type="spellStart"/>
-      <w:proofErr w:type="gramEnd"/>
-      <w:r>
-        <w:rPr>
-          <w:rFonts w:ascii="Arial Narrow" w:hAnsi="Arial Narrow"/>
-          <w:b/>
-        </w:rPr>
-        <w:t>total_buen_proceso</w:t>
-      </w:r>
-      <w:proofErr w:type="spellEnd"/>
-      <w:r>
-        <w:rPr>
-          <w:rFonts w:ascii="Arial Narrow" w:hAnsi="Arial Narrow"/>
-          <w:b/>
-        </w:rPr>
-        <w:t>}</w:t>
-      </w:r>
-      <w:r>
-        <w:rPr>
-          <w:rFonts w:ascii="Arial Narrow" w:hAnsi="Arial Narrow"/>
-          <w:b/>
-        </w:rPr>
-        <w:t xml:space="preserve"> </w:t>
-      </w:r>
-      <w:r>
-        <w:rPr>
-          <w:rFonts w:ascii="Arial Narrow" w:hAnsi="Arial Narrow"/>
-          <w:b/>
-        </w:rPr>
-        <w:t xml:space="preserve">estudiantes </w:t>
-      </w:r>
-      <w:r>
-        <w:rPr>
-          <w:rFonts w:ascii="Arial Narrow" w:hAnsi="Arial Narrow"/>
-          <w:b/>
-        </w:rPr>
-        <w:t xml:space="preserve">             </w:t>
-      </w:r>
-      <w:r>
-        <w:rPr>
-          <w:rFonts w:ascii="Arial Narrow" w:hAnsi="Arial Narrow"/>
-          <w:b/>
-        </w:rPr>
-        <w:t xml:space="preserve">   </w:t>
-      </w:r>
-      <w:r>
-        <w:rPr>
-          <w:rFonts w:ascii="Arial Narrow" w:hAnsi="Arial Narrow"/>
-          <w:b/>
-        </w:rPr>
-        <w:t xml:space="preserve"> </w:t>
-      </w:r>
-      <w:r>
-        <w:rPr>
-          <w:rFonts w:ascii="Arial Narrow" w:hAnsi="Arial Narrow"/>
-          <w:b/>
-        </w:rPr>
         <w:t xml:space="preserve">    </w:t>
       </w:r>
       <w:r>
@@ -670,39 +589,14 @@
           <w:rFonts w:ascii="Arial Narrow" w:hAnsi="Arial Narrow"/>
           <w:b/>
         </w:rPr>
-        <w:t xml:space="preserve"> </w:t>
-      </w:r>
-      <w:proofErr w:type="gramStart"/>
-      <w:r>
-        <w:rPr>
-          <w:rFonts w:ascii="Arial Narrow" w:hAnsi="Arial Narrow"/>
-          <w:b/>
-        </w:rPr>
-        <w:t xml:space="preserve">   </w:t>
-      </w:r>
-      <w:r>
-        <w:rPr>
-          <w:rFonts w:ascii="Arial Narrow" w:hAnsi="Arial Narrow"/>
-          <w:b/>
-        </w:rPr>
-        <w:t>{</w:t>
-      </w:r>
-      <w:proofErr w:type="spellStart"/>
-      <w:proofErr w:type="gramEnd"/>
-      <w:r>
-        <w:rPr>
-          <w:rFonts w:ascii="Arial Narrow" w:hAnsi="Arial Narrow"/>
-          <w:b/>
-        </w:rPr>
-        <w:t>total_proceso_terminado</w:t>
-      </w:r>
-      <w:proofErr w:type="spellEnd"/>
-      <w:r>
-        <w:rPr>
-          <w:rFonts w:ascii="Arial Narrow" w:hAnsi="Arial Narrow"/>
-          <w:b/>
-        </w:rPr>
-        <w:t>}</w:t>
+        <w:t xml:space="preserve">    </w:t>
+      </w:r>
+      <w:r>
+        <w:rPr>
+          <w:rFonts w:ascii="Arial Narrow" w:hAnsi="Arial Narrow"/>
+          <w:b/>
+        </w:rPr>
+        <w:t>{total_proceso_terminado}</w:t>
       </w:r>
       <w:r>
         <w:rPr>
@@ -932,23 +826,7 @@
           <w:rFonts w:ascii="Arial Narrow" w:hAnsi="Arial Narrow"/>
           <w:b/>
         </w:rPr>
-        <w:t>{</w:t>
-      </w:r>
-      <w:proofErr w:type="spellStart"/>
-      <w:r>
-        <w:rPr>
-          <w:rFonts w:ascii="Arial Narrow" w:hAnsi="Arial Narrow"/>
-          <w:b/>
-        </w:rPr>
-        <w:t>total_orientacion_vocacional</w:t>
-      </w:r>
-      <w:proofErr w:type="spellEnd"/>
-      <w:r>
-        <w:rPr>
-          <w:rFonts w:ascii="Arial Narrow" w:hAnsi="Arial Narrow"/>
-          <w:b/>
-        </w:rPr>
-        <w:t>}</w:t>
+        <w:t>{total_orientacion_vocacional}</w:t>
       </w:r>
       <w:r>
         <w:rPr>
@@ -1008,15 +886,7 @@
           <w:rFonts w:ascii="Arial Narrow" w:hAnsi="Arial Narrow"/>
           <w:b/>
         </w:rPr>
-        <w:t>ADOS A CONSULTORIO EXTERNO</w:t>
-      </w:r>
-      <w:proofErr w:type="gramStart"/>
-      <w:r>
-        <w:rPr>
-          <w:rFonts w:ascii="Arial Narrow" w:hAnsi="Arial Narrow"/>
-          <w:b/>
-        </w:rPr>
-        <w:t xml:space="preserve">: </w:t>
+        <w:t xml:space="preserve">ADOS A CONSULTORIO EXTERNO: </w:t>
       </w:r>
       <w:r>
         <w:rPr>
@@ -1030,24 +900,7 @@
           <w:rFonts w:ascii="Arial Narrow" w:hAnsi="Arial Narrow"/>
           <w:b/>
         </w:rPr>
-        <w:t>{</w:t>
-      </w:r>
-      <w:proofErr w:type="spellStart"/>
-      <w:proofErr w:type="gramEnd"/>
-      <w:r>
-        <w:rPr>
-          <w:rFonts w:ascii="Arial Narrow" w:hAnsi="Arial Narrow"/>
-          <w:b/>
-        </w:rPr>
-        <w:t>total_derivado_externo</w:t>
-      </w:r>
-      <w:proofErr w:type="spellEnd"/>
-      <w:r>
-        <w:rPr>
-          <w:rFonts w:ascii="Arial Narrow" w:hAnsi="Arial Narrow"/>
-          <w:b/>
-        </w:rPr>
-        <w:t>}</w:t>
+        <w:t>{total_derivado_externo}</w:t>
       </w:r>
       <w:r>
         <w:rPr>
@@ -1115,23 +968,7 @@
           <w:rFonts w:ascii="Arial Narrow" w:hAnsi="Arial Narrow"/>
           <w:bCs/>
         </w:rPr>
-        <w:t>{</w:t>
-      </w:r>
-      <w:proofErr w:type="spellStart"/>
-      <w:r>
-        <w:rPr>
-          <w:rFonts w:ascii="Arial Narrow" w:hAnsi="Arial Narrow"/>
-          <w:bCs/>
-        </w:rPr>
-        <w:t>total_sesiones</w:t>
-      </w:r>
-      <w:proofErr w:type="spellEnd"/>
-      <w:r>
-        <w:rPr>
-          <w:rFonts w:ascii="Arial Narrow" w:hAnsi="Arial Narrow"/>
-          <w:bCs/>
-        </w:rPr>
-        <w:t>}</w:t>
+        <w:t>{total_sesiones}</w:t>
       </w:r>
       <w:r>
         <w:rPr>
@@ -1180,43 +1017,15 @@
           <w:b/>
           <w:u w:val="single"/>
         </w:rPr>
-        <w:t>PERIODO</w:t>
-      </w:r>
-      <w:proofErr w:type="gramStart"/>
+        <w:t xml:space="preserve">PERIODO:  </w:t>
+      </w:r>
       <w:r>
         <w:rPr>
           <w:rFonts w:ascii="Arial Narrow" w:hAnsi="Arial Narrow"/>
           <w:b/>
           <w:u w:val="single"/>
         </w:rPr>
-        <w:t xml:space="preserve">:  </w:t>
-      </w:r>
-      <w:r>
-        <w:rPr>
-          <w:rFonts w:ascii="Arial Narrow" w:hAnsi="Arial Narrow"/>
-          <w:b/>
-          <w:u w:val="single"/>
-        </w:rPr>
-        <w:t>{</w:t>
-      </w:r>
-      <w:proofErr w:type="spellStart"/>
-      <w:proofErr w:type="gramEnd"/>
-      <w:r>
-        <w:rPr>
-          <w:rFonts w:ascii="Arial Narrow" w:hAnsi="Arial Narrow"/>
-          <w:b/>
-          <w:u w:val="single"/>
-        </w:rPr>
-        <w:t>mes_anio</w:t>
-      </w:r>
-      <w:proofErr w:type="spellEnd"/>
-      <w:r>
-        <w:rPr>
-          <w:rFonts w:ascii="Arial Narrow" w:hAnsi="Arial Narrow"/>
-          <w:b/>
-          <w:u w:val="single"/>
-        </w:rPr>
-        <w:t>}</w:t>
+        <w:t>{mes_anio}</w:t>
       </w:r>
     </w:p>
     <w:tbl>
@@ -1254,7 +1063,6 @@
                 <w:b/>
               </w:rPr>
             </w:pPr>
-            <w:proofErr w:type="spellStart"/>
             <w:r>
               <w:rPr>
                 <w:rFonts w:ascii="Arial Narrow" w:hAnsi="Arial Narrow"/>
@@ -1262,7 +1070,6 @@
               </w:rPr>
               <w:t>N°</w:t>
             </w:r>
-            <w:proofErr w:type="spellEnd"/>
           </w:p>
         </w:tc>
         <w:tc>
@@ -1462,23 +1269,7 @@
                 <w:rFonts w:ascii="Arial Narrow" w:hAnsi="Arial Narrow"/>
                 <w:b/>
               </w:rPr>
-              <w:t>{#pacientes} {</w:t>
-            </w:r>
-            <w:proofErr w:type="spellStart"/>
-            <w:r>
-              <w:rPr>
-                <w:rFonts w:ascii="Arial Narrow" w:hAnsi="Arial Narrow"/>
-                <w:b/>
-              </w:rPr>
-              <w:t>nro</w:t>
-            </w:r>
-            <w:proofErr w:type="spellEnd"/>
-            <w:r>
-              <w:rPr>
-                <w:rFonts w:ascii="Arial Narrow" w:hAnsi="Arial Narrow"/>
-                <w:b/>
-              </w:rPr>
-              <w:t>}</w:t>
+              <w:t>{#pacientes} {nro}</w:t>
             </w:r>
           </w:p>
         </w:tc>
@@ -1520,23 +1311,7 @@
                 <w:rFonts w:ascii="Arial Narrow" w:hAnsi="Arial Narrow"/>
                 <w:bCs/>
               </w:rPr>
-              <w:t>{</w:t>
-            </w:r>
-            <w:proofErr w:type="spellStart"/>
-            <w:r>
-              <w:rPr>
-                <w:rFonts w:ascii="Arial Narrow" w:hAnsi="Arial Narrow"/>
-                <w:bCs/>
-              </w:rPr>
-              <w:t>principalProblematica</w:t>
-            </w:r>
-            <w:proofErr w:type="spellEnd"/>
-            <w:r>
-              <w:rPr>
-                <w:rFonts w:ascii="Arial Narrow" w:hAnsi="Arial Narrow"/>
-                <w:bCs/>
-              </w:rPr>
-              <w:t>}</w:t>
+              <w:t>{principalProblematica}</w:t>
             </w:r>
           </w:p>
         </w:tc>
@@ -1557,23 +1332,7 @@
                 <w:rFonts w:ascii="Arial Narrow" w:hAnsi="Arial Narrow" w:cstheme="minorHAnsi"/>
                 <w:bCs/>
               </w:rPr>
-              <w:t>{</w:t>
-            </w:r>
-            <w:proofErr w:type="spellStart"/>
-            <w:r>
-              <w:rPr>
-                <w:rFonts w:ascii="Arial Narrow" w:hAnsi="Arial Narrow" w:cstheme="minorHAnsi"/>
-                <w:bCs/>
-              </w:rPr>
-              <w:t>derivadoPor</w:t>
-            </w:r>
-            <w:proofErr w:type="spellEnd"/>
-            <w:r>
-              <w:rPr>
-                <w:rFonts w:ascii="Arial Narrow" w:hAnsi="Arial Narrow" w:cstheme="minorHAnsi"/>
-                <w:bCs/>
-              </w:rPr>
-              <w:t>}</w:t>
+              <w:t>{derivadoPor}</w:t>
             </w:r>
           </w:p>
         </w:tc>
@@ -1615,23 +1374,7 @@
                 <w:rFonts w:ascii="Arial Narrow" w:hAnsi="Arial Narrow"/>
                 <w:bCs/>
               </w:rPr>
-              <w:t>{</w:t>
-            </w:r>
-            <w:proofErr w:type="spellStart"/>
-            <w:r>
-              <w:rPr>
-                <w:rFonts w:ascii="Arial Narrow" w:hAnsi="Arial Narrow"/>
-                <w:bCs/>
-              </w:rPr>
-              <w:t>situacionCaso</w:t>
-            </w:r>
-            <w:proofErr w:type="spellEnd"/>
-            <w:r>
-              <w:rPr>
-                <w:rFonts w:ascii="Arial Narrow" w:hAnsi="Arial Narrow"/>
-                <w:bCs/>
-              </w:rPr>
-              <w:t>}</w:t>
+              <w:t>{situacionCaso}</w:t>
             </w:r>
           </w:p>
         </w:tc>
@@ -1698,7 +1441,6 @@
               </w:rPr>
               <w:t>{</w:t>
             </w:r>
-            <w:proofErr w:type="spellStart"/>
             <w:r>
               <w:rPr>
                 <w:rFonts w:ascii="Arial Narrow" w:hAnsi="Arial Narrow"/>
@@ -1706,7 +1448,6 @@
               </w:rPr>
               <w:t>descripcion</w:t>
             </w:r>
-            <w:proofErr w:type="spellEnd"/>
             <w:r>
               <w:rPr>
                 <w:rFonts w:ascii="Arial Narrow" w:hAnsi="Arial Narrow"/>
@@ -1791,21 +1532,7 @@
         <w:rPr>
           <w:rFonts w:ascii="Arial Narrow" w:hAnsi="Arial Narrow"/>
         </w:rPr>
-        <w:t>{</w:t>
-      </w:r>
-      <w:proofErr w:type="spellStart"/>
-      <w:r>
-        <w:rPr>
-          <w:rFonts w:ascii="Arial Narrow" w:hAnsi="Arial Narrow"/>
-        </w:rPr>
-        <w:t>problematica</w:t>
-      </w:r>
-      <w:proofErr w:type="spellEnd"/>
-      <w:r>
-        <w:rPr>
-          <w:rFonts w:ascii="Arial Narrow" w:hAnsi="Arial Narrow"/>
-        </w:rPr>
-        <w:t>}</w:t>
+        <w:t>{problematica}</w:t>
       </w:r>
     </w:p>
     <w:p>
@@ -1820,23 +1547,7 @@
           <w:rFonts w:ascii="Arial Narrow" w:hAnsi="Arial Narrow"/>
           <w:bCs/>
         </w:rPr>
-        <w:t>{/</w:t>
-      </w:r>
-      <w:proofErr w:type="spellStart"/>
-      <w:r>
-        <w:rPr>
-          <w:rFonts w:ascii="Arial Narrow" w:hAnsi="Arial Narrow"/>
-          <w:bCs/>
-        </w:rPr>
-        <w:t>problematicas_frecuentes</w:t>
-      </w:r>
-      <w:proofErr w:type="spellEnd"/>
-      <w:r>
-        <w:rPr>
-          <w:rFonts w:ascii="Arial Narrow" w:hAnsi="Arial Narrow"/>
-          <w:bCs/>
-        </w:rPr>
-        <w:t>}</w:t>
+        <w:t>{/problematicas_frecuentes}</w:t>
       </w:r>
     </w:p>
     <w:p>
@@ -1873,7 +1584,6 @@
           <w:rFonts w:ascii="Arial Narrow" w:hAnsi="Arial Narrow"/>
         </w:rPr>
       </w:pPr>
-      <w:proofErr w:type="spellStart"/>
       <w:r>
         <w:rPr>
           <w:rFonts w:ascii="Arial Narrow" w:hAnsi="Arial Narrow"/>
@@ -1881,36 +1591,13 @@
           <w:bCs/>
         </w:rPr>
         <w:lastRenderedPageBreak/>
-        <w:t>Numero</w:t>
-      </w:r>
-      <w:proofErr w:type="spellEnd"/>
-      <w:r>
-        <w:rPr>
-          <w:rFonts w:ascii="Arial Narrow" w:hAnsi="Arial Narrow"/>
-          <w:b/>
-          <w:bCs/>
-        </w:rPr>
-        <w:t xml:space="preserve"> total de actividades:</w:t>
-      </w:r>
-      <w:r>
-        <w:rPr>
-          <w:rFonts w:ascii="Arial Narrow" w:hAnsi="Arial Narrow"/>
-        </w:rPr>
-        <w:t xml:space="preserve"> {</w:t>
-      </w:r>
-      <w:proofErr w:type="spellStart"/>
-      <w:r>
-        <w:rPr>
-          <w:rFonts w:ascii="Arial Narrow" w:hAnsi="Arial Narrow"/>
-        </w:rPr>
-        <w:t>total_actividades</w:t>
-      </w:r>
-      <w:proofErr w:type="spellEnd"/>
-      <w:r>
-        <w:rPr>
-          <w:rFonts w:ascii="Arial Narrow" w:hAnsi="Arial Narrow"/>
-        </w:rPr>
-        <w:t>}</w:t>
+        <w:t>Numero total de actividades:</w:t>
+      </w:r>
+      <w:r>
+        <w:rPr>
+          <w:rFonts w:ascii="Arial Narrow" w:hAnsi="Arial Narrow"/>
+        </w:rPr>
+        <w:t xml:space="preserve"> {total_actividades}</w:t>
       </w:r>
     </w:p>
     <w:p>
@@ -1944,21 +1631,7 @@
         <w:rPr>
           <w:rFonts w:ascii="Arial Narrow" w:hAnsi="Arial Narrow"/>
         </w:rPr>
-        <w:t xml:space="preserve"> {</w:t>
-      </w:r>
-      <w:proofErr w:type="spellStart"/>
-      <w:r>
-        <w:rPr>
-          <w:rFonts w:ascii="Arial Narrow" w:hAnsi="Arial Narrow"/>
-        </w:rPr>
-        <w:t>titulo_act</w:t>
-      </w:r>
-      <w:proofErr w:type="spellEnd"/>
-      <w:r>
-        <w:rPr>
-          <w:rFonts w:ascii="Arial Narrow" w:hAnsi="Arial Narrow"/>
-        </w:rPr>
-        <w:t>}</w:t>
+        <w:t xml:space="preserve"> {titulo_act}</w:t>
       </w:r>
     </w:p>
     <w:p>
@@ -1979,21 +1652,7 @@
         <w:rPr>
           <w:rFonts w:ascii="Arial Narrow" w:hAnsi="Arial Narrow"/>
         </w:rPr>
-        <w:t xml:space="preserve"> {</w:t>
-      </w:r>
-      <w:proofErr w:type="spellStart"/>
-      <w:r>
-        <w:rPr>
-          <w:rFonts w:ascii="Arial Narrow" w:hAnsi="Arial Narrow"/>
-        </w:rPr>
-        <w:t>psicologo_act</w:t>
-      </w:r>
-      <w:proofErr w:type="spellEnd"/>
-      <w:r>
-        <w:rPr>
-          <w:rFonts w:ascii="Arial Narrow" w:hAnsi="Arial Narrow"/>
-        </w:rPr>
-        <w:t>}</w:t>
+        <w:t xml:space="preserve"> {psicologo_act}</w:t>
       </w:r>
     </w:p>
     <w:p>
@@ -2014,21 +1673,7 @@
         <w:rPr>
           <w:rFonts w:ascii="Arial Narrow" w:hAnsi="Arial Narrow"/>
         </w:rPr>
-        <w:t xml:space="preserve"> {</w:t>
-      </w:r>
-      <w:proofErr w:type="spellStart"/>
-      <w:r>
-        <w:rPr>
-          <w:rFonts w:ascii="Arial Narrow" w:hAnsi="Arial Narrow"/>
-        </w:rPr>
-        <w:t>fecha_inicio_act</w:t>
-      </w:r>
-      <w:proofErr w:type="spellEnd"/>
-      <w:r>
-        <w:rPr>
-          <w:rFonts w:ascii="Arial Narrow" w:hAnsi="Arial Narrow"/>
-        </w:rPr>
-        <w:t>}</w:t>
+        <w:t xml:space="preserve"> {fecha_inicio_act}</w:t>
       </w:r>
     </w:p>
     <w:p>
@@ -2049,21 +1694,7 @@
         <w:rPr>
           <w:rFonts w:ascii="Arial Narrow" w:hAnsi="Arial Narrow"/>
         </w:rPr>
-        <w:t xml:space="preserve"> {</w:t>
-      </w:r>
-      <w:proofErr w:type="spellStart"/>
-      <w:r>
-        <w:rPr>
-          <w:rFonts w:ascii="Arial Narrow" w:hAnsi="Arial Narrow"/>
-        </w:rPr>
-        <w:t>fecha_fin_act</w:t>
-      </w:r>
-      <w:proofErr w:type="spellEnd"/>
-      <w:r>
-        <w:rPr>
-          <w:rFonts w:ascii="Arial Narrow" w:hAnsi="Arial Narrow"/>
-        </w:rPr>
-        <w:t>}</w:t>
+        <w:t xml:space="preserve"> {fecha_fin_act}</w:t>
       </w:r>
     </w:p>
     <w:p>
@@ -2084,21 +1715,7 @@
         <w:rPr>
           <w:rFonts w:ascii="Arial Narrow" w:hAnsi="Arial Narrow"/>
         </w:rPr>
-        <w:t xml:space="preserve"> {</w:t>
-      </w:r>
-      <w:proofErr w:type="spellStart"/>
-      <w:r>
-        <w:rPr>
-          <w:rFonts w:ascii="Arial Narrow" w:hAnsi="Arial Narrow"/>
-        </w:rPr>
-        <w:t>objetivo_act</w:t>
-      </w:r>
-      <w:proofErr w:type="spellEnd"/>
-      <w:r>
-        <w:rPr>
-          <w:rFonts w:ascii="Arial Narrow" w:hAnsi="Arial Narrow"/>
-        </w:rPr>
-        <w:t>}</w:t>
+        <w:t xml:space="preserve"> {objetivo_act}</w:t>
       </w:r>
     </w:p>
     <w:p>
@@ -2119,21 +1736,7 @@
         <w:rPr>
           <w:rFonts w:ascii="Arial Narrow" w:hAnsi="Arial Narrow"/>
         </w:rPr>
-        <w:t xml:space="preserve"> {</w:t>
-      </w:r>
-      <w:proofErr w:type="spellStart"/>
-      <w:r>
-        <w:rPr>
-          <w:rFonts w:ascii="Arial Narrow" w:hAnsi="Arial Narrow"/>
-        </w:rPr>
-        <w:t>poblacion_act</w:t>
-      </w:r>
-      <w:proofErr w:type="spellEnd"/>
-      <w:r>
-        <w:rPr>
-          <w:rFonts w:ascii="Arial Narrow" w:hAnsi="Arial Narrow"/>
-        </w:rPr>
-        <w:t>}</w:t>
+        <w:t xml:space="preserve"> {poblacion_act}</w:t>
       </w:r>
     </w:p>
     <w:p>
@@ -2154,21 +1757,7 @@
         <w:rPr>
           <w:rFonts w:ascii="Arial Narrow" w:hAnsi="Arial Narrow"/>
         </w:rPr>
-        <w:t xml:space="preserve"> {</w:t>
-      </w:r>
-      <w:proofErr w:type="spellStart"/>
-      <w:r>
-        <w:rPr>
-          <w:rFonts w:ascii="Arial Narrow" w:hAnsi="Arial Narrow"/>
-        </w:rPr>
-        <w:t>asistentes_act</w:t>
-      </w:r>
-      <w:proofErr w:type="spellEnd"/>
-      <w:r>
-        <w:rPr>
-          <w:rFonts w:ascii="Arial Narrow" w:hAnsi="Arial Narrow"/>
-        </w:rPr>
-        <w:t>}</w:t>
+        <w:t xml:space="preserve"> {asistentes_act}</w:t>
       </w:r>
     </w:p>
     <w:p>
@@ -2189,21 +1778,7 @@
         <w:rPr>
           <w:rFonts w:ascii="Arial Narrow" w:hAnsi="Arial Narrow"/>
         </w:rPr>
-        <w:t xml:space="preserve"> {</w:t>
-      </w:r>
-      <w:proofErr w:type="spellStart"/>
-      <w:r>
-        <w:rPr>
-          <w:rFonts w:ascii="Arial Narrow" w:hAnsi="Arial Narrow"/>
-        </w:rPr>
-        <w:t>resumen_act</w:t>
-      </w:r>
-      <w:proofErr w:type="spellEnd"/>
-      <w:r>
-        <w:rPr>
-          <w:rFonts w:ascii="Arial Narrow" w:hAnsi="Arial Narrow"/>
-        </w:rPr>
-        <w:t>}</w:t>
+        <w:t xml:space="preserve"> {resumen_act}</w:t>
       </w:r>
     </w:p>
     <w:p>
@@ -2224,21 +1799,7 @@
         <w:rPr>
           <w:rFonts w:ascii="Arial Narrow" w:hAnsi="Arial Narrow"/>
         </w:rPr>
-        <w:t xml:space="preserve"> {</w:t>
-      </w:r>
-      <w:proofErr w:type="spellStart"/>
-      <w:r>
-        <w:rPr>
-          <w:rFonts w:ascii="Arial Narrow" w:hAnsi="Arial Narrow"/>
-        </w:rPr>
-        <w:t>resultados_act</w:t>
-      </w:r>
-      <w:proofErr w:type="spellEnd"/>
-      <w:r>
-        <w:rPr>
-          <w:rFonts w:ascii="Arial Narrow" w:hAnsi="Arial Narrow"/>
-        </w:rPr>
-        <w:t>}</w:t>
+        <w:t xml:space="preserve"> {resultados_act}</w:t>
       </w:r>
     </w:p>
     <w:p>
@@ -2278,21 +1839,7 @@
         <w:rPr>
           <w:rFonts w:ascii="Arial Narrow" w:hAnsi="Arial Narrow"/>
         </w:rPr>
-        <w:t>{%</w:t>
-      </w:r>
-      <w:proofErr w:type="spellStart"/>
-      <w:r>
-        <w:rPr>
-          <w:rFonts w:ascii="Arial Narrow" w:hAnsi="Arial Narrow"/>
-        </w:rPr>
-        <w:t>img</w:t>
-      </w:r>
-      <w:proofErr w:type="spellEnd"/>
-      <w:r>
-        <w:rPr>
-          <w:rFonts w:ascii="Arial Narrow" w:hAnsi="Arial Narrow"/>
-        </w:rPr>
-        <w:t>}</w:t>
+        <w:t>{%img}</w:t>
       </w:r>
     </w:p>
     <w:p>
@@ -2305,21 +1852,7 @@
         <w:rPr>
           <w:rFonts w:ascii="Arial Narrow" w:hAnsi="Arial Narrow"/>
         </w:rPr>
-        <w:t>{/</w:t>
-      </w:r>
-      <w:proofErr w:type="spellStart"/>
-      <w:r>
-        <w:rPr>
-          <w:rFonts w:ascii="Arial Narrow" w:hAnsi="Arial Narrow"/>
-        </w:rPr>
-        <w:t>evidencias_img</w:t>
-      </w:r>
-      <w:proofErr w:type="spellEnd"/>
-      <w:r>
-        <w:rPr>
-          <w:rFonts w:ascii="Arial Narrow" w:hAnsi="Arial Narrow"/>
-        </w:rPr>
-        <w:t>}</w:t>
+        <w:t>{/evidencias_img}</w:t>
       </w:r>
     </w:p>
     <w:p>
@@ -2390,7 +1923,13 @@
         <w:rPr>
           <w:rFonts w:ascii="Arial Narrow" w:hAnsi="Arial Narrow"/>
         </w:rPr>
-        <w:t>Psi. Franz Reynaldo Loayza Marquez</w:t>
+        <w:t xml:space="preserve">Psi. </w:t>
+      </w:r>
+      <w:r>
+        <w:rPr>
+          <w:rFonts w:ascii="Arial Narrow" w:hAnsi="Arial Narrow"/>
+        </w:rPr>
+        <w:t>{nombre_psicologo}</w:t>
       </w:r>
     </w:p>
     <w:p>
@@ -4079,6 +3618,7 @@
   <w:style w:type="character" w:default="1" w:styleId="Fuentedeprrafopredeter">
     <w:name w:val="Default Paragraph Font"/>
     <w:uiPriority w:val="1"/>
+    <w:semiHidden/>
     <w:unhideWhenUsed/>
   </w:style>
   <w:style w:type="table" w:default="1" w:styleId="Tablanormal">

</xml_diff>